<commit_message>
change responce for some question in tree strucutre and add suggestion in docx
</commit_message>
<xml_diff>
--- a/question/Questionnaire - Destinations.docx
+++ b/question/Questionnaire - Destinations.docx
@@ -276,14 +276,14 @@
           <w:b w:val="1"/>
           <w:rtl w:val="0"/>
         </w:rPr>
-        <w:t xml:space="preserve">Quel est votre niveau de confort avec les langues étrangères ?</w:t>
-      </w:r>
-    </w:p>
-    <w:p>
-      <w:pPr>
-        <w:numPr>
-          <w:ilvl w:val="0"/>
-          <w:numId w:val="8"/>
+        <w:t xml:space="preserve">Quel est votre niveau de confort avec les langues étrangères autre que l’anglais ?</w:t>
+      </w:r>
+    </w:p>
+    <w:p>
+      <w:pPr>
+        <w:numPr>
+          <w:ilvl w:val="0"/>
+          <w:numId w:val="44"/>
         </w:numPr>
         <w:spacing w:after="0" w:afterAutospacing="0" w:before="0" w:beforeAutospacing="0" w:lineRule="auto"/>
         <w:ind w:left="720" w:hanging="360"/>
@@ -296,14 +296,14 @@
           <w:rFonts w:ascii="Lexend" w:cs="Lexend" w:eastAsia="Lexend" w:hAnsi="Lexend"/>
           <w:rtl w:val="0"/>
         </w:rPr>
-        <w:t xml:space="preserve">Je suis à l’aise avec plusieurs langues</w:t>
-      </w:r>
-    </w:p>
-    <w:p>
-      <w:pPr>
-        <w:numPr>
-          <w:ilvl w:val="0"/>
-          <w:numId w:val="8"/>
+        <w:t xml:space="preserve">Je suis à l’aise avec plusieurs langues  (même que la réponse suivante)</w:t>
+      </w:r>
+    </w:p>
+    <w:p>
+      <w:pPr>
+        <w:numPr>
+          <w:ilvl w:val="0"/>
+          <w:numId w:val="44"/>
         </w:numPr>
         <w:spacing w:after="0" w:afterAutospacing="0" w:before="0" w:beforeAutospacing="0" w:lineRule="auto"/>
         <w:ind w:left="720" w:hanging="360"/>
@@ -323,7 +323,7 @@
       <w:pPr>
         <w:numPr>
           <w:ilvl w:val="0"/>
-          <w:numId w:val="8"/>
+          <w:numId w:val="44"/>
         </w:numPr>
         <w:spacing w:after="240" w:before="0" w:beforeAutospacing="0" w:lineRule="auto"/>
         <w:ind w:left="720" w:hanging="360"/>
@@ -341,26 +341,25 @@
     </w:p>
     <w:p>
       <w:pPr>
-        <w:ind w:left="720" w:firstLine="0"/>
-        <w:rPr>
-          <w:rFonts w:ascii="Lexend" w:cs="Lexend" w:eastAsia="Lexend" w:hAnsi="Lexend"/>
-          <w:b w:val="1"/>
-        </w:rPr>
-      </w:pPr>
-      <w:r>
-        <w:rPr>
-          <w:rtl w:val="0"/>
-        </w:rPr>
-      </w:r>
-    </w:p>
-    <w:p>
-      <w:pPr>
-        <w:numPr>
-          <w:ilvl w:val="0"/>
+        <w:spacing w:after="240" w:before="240" w:lineRule="auto"/>
+        <w:rPr>
+          <w:rFonts w:ascii="Lexend" w:cs="Lexend" w:eastAsia="Lexend" w:hAnsi="Lexend"/>
+        </w:rPr>
+      </w:pPr>
+      <w:r>
+        <w:rPr>
+          <w:rtl w:val="0"/>
+        </w:rPr>
+      </w:r>
+    </w:p>
+    <w:p>
+      <w:pPr>
+        <w:numPr>
+          <w:ilvl w:val="1"/>
           <w:numId w:val="4"/>
         </w:numPr>
-        <w:spacing w:after="0" w:afterAutospacing="0"/>
-        <w:ind w:left="720" w:hanging="360"/>
+        <w:spacing w:after="0" w:afterAutospacing="0" w:before="240" w:lineRule="auto"/>
+        <w:ind w:left="1440" w:hanging="360"/>
         <w:rPr>
           <w:rFonts w:ascii="Lexend" w:cs="Lexend" w:eastAsia="Lexend" w:hAnsi="Lexend"/>
           <w:b w:val="1"/>
@@ -373,6 +372,173 @@
           <w:b w:val="1"/>
           <w:rtl w:val="0"/>
         </w:rPr>
+        <w:t xml:space="preserve">Quelle est cette ou ces langues ?</w:t>
+      </w:r>
+    </w:p>
+    <w:p>
+      <w:pPr>
+        <w:numPr>
+          <w:ilvl w:val="0"/>
+          <w:numId w:val="10"/>
+        </w:numPr>
+        <w:spacing w:after="240" w:before="0" w:beforeAutospacing="0" w:lineRule="auto"/>
+        <w:ind w:left="1440" w:hanging="360"/>
+        <w:rPr>
+          <w:rFonts w:ascii="Lexend" w:cs="Lexend" w:eastAsia="Lexend" w:hAnsi="Lexend"/>
+        </w:rPr>
+      </w:pPr>
+      <w:r>
+        <w:rPr>
+          <w:rFonts w:ascii="Lexend" w:cs="Lexend" w:eastAsia="Lexend" w:hAnsi="Lexend"/>
+          <w:rtl w:val="0"/>
+        </w:rPr>
+        <w:t xml:space="preserve">( Liste de langue )</w:t>
+      </w:r>
+    </w:p>
+    <w:p>
+      <w:pPr>
+        <w:spacing w:after="240" w:before="240" w:lineRule="auto"/>
+        <w:rPr>
+          <w:rFonts w:ascii="Lexend" w:cs="Lexend" w:eastAsia="Lexend" w:hAnsi="Lexend"/>
+        </w:rPr>
+      </w:pPr>
+      <w:r>
+        <w:rPr>
+          <w:rtl w:val="0"/>
+        </w:rPr>
+      </w:r>
+    </w:p>
+    <w:p>
+      <w:pPr>
+        <w:numPr>
+          <w:ilvl w:val="0"/>
+          <w:numId w:val="4"/>
+        </w:numPr>
+        <w:spacing w:after="0" w:afterAutospacing="0" w:before="240" w:lineRule="auto"/>
+        <w:ind w:left="720" w:hanging="360"/>
+        <w:rPr>
+          <w:rFonts w:ascii="Lexend" w:cs="Lexend" w:eastAsia="Lexend" w:hAnsi="Lexend"/>
+          <w:b w:val="1"/>
+          <w:u w:val="none"/>
+        </w:rPr>
+      </w:pPr>
+      <w:r>
+        <w:rPr>
+          <w:rFonts w:ascii="Lexend" w:cs="Lexend" w:eastAsia="Lexend" w:hAnsi="Lexend"/>
+          <w:b w:val="1"/>
+          <w:rtl w:val="0"/>
+        </w:rPr>
+        <w:t xml:space="preserve">Quel est votre niveau de confort avec l’anglais ?</w:t>
+      </w:r>
+    </w:p>
+    <w:p>
+      <w:pPr>
+        <w:numPr>
+          <w:ilvl w:val="0"/>
+          <w:numId w:val="42"/>
+        </w:numPr>
+        <w:spacing w:after="0" w:afterAutospacing="0" w:before="0" w:beforeAutospacing="0" w:lineRule="auto"/>
+        <w:ind w:left="720" w:hanging="360"/>
+        <w:rPr>
+          <w:rFonts w:ascii="Lexend" w:cs="Lexend" w:eastAsia="Lexend" w:hAnsi="Lexend"/>
+        </w:rPr>
+      </w:pPr>
+      <w:r>
+        <w:rPr>
+          <w:rFonts w:ascii="Lexend" w:cs="Lexend" w:eastAsia="Lexend" w:hAnsi="Lexend"/>
+          <w:rtl w:val="0"/>
+        </w:rPr>
+        <w:t xml:space="preserve">Assez bon</w:t>
+      </w:r>
+    </w:p>
+    <w:p>
+      <w:pPr>
+        <w:numPr>
+          <w:ilvl w:val="0"/>
+          <w:numId w:val="42"/>
+        </w:numPr>
+        <w:spacing w:after="0" w:afterAutospacing="0" w:before="0" w:beforeAutospacing="0" w:lineRule="auto"/>
+        <w:ind w:left="720" w:hanging="360"/>
+        <w:rPr>
+          <w:rFonts w:ascii="Lexend" w:cs="Lexend" w:eastAsia="Lexend" w:hAnsi="Lexend"/>
+        </w:rPr>
+      </w:pPr>
+      <w:r>
+        <w:rPr>
+          <w:rFonts w:ascii="Lexend" w:cs="Lexend" w:eastAsia="Lexend" w:hAnsi="Lexend"/>
+          <w:rtl w:val="0"/>
+        </w:rPr>
+        <w:t xml:space="preserve">Très Bon</w:t>
+      </w:r>
+    </w:p>
+    <w:p>
+      <w:pPr>
+        <w:numPr>
+          <w:ilvl w:val="0"/>
+          <w:numId w:val="42"/>
+        </w:numPr>
+        <w:spacing w:after="240" w:before="0" w:beforeAutospacing="0" w:lineRule="auto"/>
+        <w:ind w:left="720" w:hanging="360"/>
+        <w:rPr>
+          <w:rFonts w:ascii="Lexend" w:cs="Lexend" w:eastAsia="Lexend" w:hAnsi="Lexend"/>
+        </w:rPr>
+      </w:pPr>
+      <w:r>
+        <w:rPr>
+          <w:rFonts w:ascii="Lexend" w:cs="Lexend" w:eastAsia="Lexend" w:hAnsi="Lexend"/>
+          <w:rtl w:val="0"/>
+        </w:rPr>
+        <w:t xml:space="preserve">Bilangue</w:t>
+      </w:r>
+    </w:p>
+    <w:p>
+      <w:pPr>
+        <w:spacing w:after="240" w:before="240" w:lineRule="auto"/>
+        <w:ind w:left="0" w:firstLine="0"/>
+        <w:rPr>
+          <w:rFonts w:ascii="Lexend" w:cs="Lexend" w:eastAsia="Lexend" w:hAnsi="Lexend"/>
+        </w:rPr>
+      </w:pPr>
+      <w:r>
+        <w:rPr>
+          <w:rtl w:val="0"/>
+        </w:rPr>
+      </w:r>
+    </w:p>
+    <w:p>
+      <w:pPr>
+        <w:ind w:left="720" w:firstLine="0"/>
+        <w:rPr>
+          <w:rFonts w:ascii="Lexend" w:cs="Lexend" w:eastAsia="Lexend" w:hAnsi="Lexend"/>
+          <w:b w:val="1"/>
+        </w:rPr>
+      </w:pPr>
+      <w:r>
+        <w:rPr>
+          <w:rtl w:val="0"/>
+        </w:rPr>
+      </w:r>
+    </w:p>
+    <w:p>
+      <w:pPr>
+        <w:numPr>
+          <w:ilvl w:val="0"/>
+          <w:numId w:val="4"/>
+        </w:numPr>
+        <w:spacing w:after="0" w:afterAutospacing="0"/>
+        <w:ind w:left="720" w:hanging="360"/>
+        <w:rPr>
+          <w:rFonts w:ascii="Lexend" w:cs="Lexend" w:eastAsia="Lexend" w:hAnsi="Lexend"/>
+          <w:b w:val="1"/>
+          <w:u w:val="none"/>
+        </w:rPr>
+      </w:pPr>
+      <w:r>
+        <w:rPr>
+          <w:rFonts w:ascii="Lexend" w:cs="Lexend" w:eastAsia="Lexend" w:hAnsi="Lexend"/>
+          <w:b w:val="1"/>
+          <w:rtl w:val="0"/>
+        </w:rPr>
         <w:t xml:space="preserve">Quel climat préférez-vous pour vos vacances ?</w:t>
       </w:r>
     </w:p>
@@ -598,7 +764,22 @@
           <w:b w:val="1"/>
           <w:rtl w:val="0"/>
         </w:rPr>
-        <w:t xml:space="preserve">Quel est votre budget pour ces vacances ?</w:t>
+        <w:t xml:space="preserve">Quel est votre budget pour ces vacances ? </w:t>
+      </w:r>
+      <w:ins w:author="Johan DAMIOT" w:id="0" w:date="2024-10-14T08:33:01Z">
+        <w:r>
+          <w:rPr>
+            <w:rFonts w:ascii="Lexend" w:cs="Lexend" w:eastAsia="Lexend" w:hAnsi="Lexend"/>
+            <w:b w:val="1"/>
+            <w:rtl w:val="0"/>
+          </w:rPr>
+          <w:t xml:space="preserve"> Pour le quiz voyage plutôt </w:t>
+        </w:r>
+      </w:ins>
+      <w:r>
+        <w:rPr>
+          <w:rtl w:val="0"/>
+        </w:rPr>
       </w:r>
     </w:p>
     <w:p>
@@ -823,7 +1004,22 @@
           <w:b w:val="1"/>
           <w:rtl w:val="0"/>
         </w:rPr>
-        <w:t xml:space="preserve">Combien de temps avez-vous pour ces vacances ?</w:t>
+        <w:t xml:space="preserve">Combien de temps avez-vous pour ces vacances ? </w:t>
+      </w:r>
+      <w:ins w:author="Johan DAMIOT" w:id="1" w:date="2024-10-14T08:32:46Z">
+        <w:r>
+          <w:rPr>
+            <w:rFonts w:ascii="Lexend" w:cs="Lexend" w:eastAsia="Lexend" w:hAnsi="Lexend"/>
+            <w:b w:val="1"/>
+            <w:rtl w:val="0"/>
+          </w:rPr>
+          <w:t xml:space="preserve">Pour le quiz voyage plutôt</w:t>
+        </w:r>
+      </w:ins>
+      <w:r>
+        <w:rPr>
+          <w:rtl w:val="0"/>
+        </w:rPr>
       </w:r>
     </w:p>
     <w:p>
@@ -1175,7 +1371,7 @@
       <w:pPr>
         <w:numPr>
           <w:ilvl w:val="0"/>
-          <w:numId w:val="44"/>
+          <w:numId w:val="46"/>
         </w:numPr>
         <w:spacing w:after="0" w:afterAutospacing="0" w:before="240" w:lineRule="auto"/>
         <w:ind w:left="720" w:hanging="360"/>
@@ -1195,7 +1391,7 @@
       <w:pPr>
         <w:numPr>
           <w:ilvl w:val="0"/>
-          <w:numId w:val="44"/>
+          <w:numId w:val="46"/>
         </w:numPr>
         <w:spacing w:after="240" w:before="0" w:beforeAutospacing="0" w:lineRule="auto"/>
         <w:ind w:left="720" w:hanging="360"/>
@@ -1229,7 +1425,7 @@
       <w:pPr>
         <w:numPr>
           <w:ilvl w:val="0"/>
-          <w:numId w:val="42"/>
+          <w:numId w:val="43"/>
         </w:numPr>
         <w:spacing w:after="0" w:afterAutospacing="0" w:before="240" w:lineRule="auto"/>
         <w:ind w:left="720" w:hanging="360"/>
@@ -1249,7 +1445,7 @@
       <w:pPr>
         <w:numPr>
           <w:ilvl w:val="0"/>
-          <w:numId w:val="42"/>
+          <w:numId w:val="43"/>
         </w:numPr>
         <w:spacing w:after="240" w:before="0" w:beforeAutospacing="0" w:lineRule="auto"/>
         <w:ind w:left="720" w:hanging="360"/>
@@ -1391,7 +1587,7 @@
       <w:pPr>
         <w:numPr>
           <w:ilvl w:val="0"/>
-          <w:numId w:val="9"/>
+          <w:numId w:val="8"/>
         </w:numPr>
         <w:spacing w:after="0" w:afterAutospacing="0" w:before="240" w:lineRule="auto"/>
         <w:ind w:left="720" w:hanging="360"/>
@@ -1411,7 +1607,7 @@
       <w:pPr>
         <w:numPr>
           <w:ilvl w:val="0"/>
-          <w:numId w:val="9"/>
+          <w:numId w:val="8"/>
         </w:numPr>
         <w:spacing w:after="240" w:before="0" w:beforeAutospacing="0" w:lineRule="auto"/>
         <w:ind w:left="720" w:hanging="360"/>
@@ -1461,7 +1657,22 @@
           <w:b w:val="1"/>
           <w:rtl w:val="0"/>
         </w:rPr>
-        <w:t xml:space="preserve">Voyagez-vous seul, en couple, en famille ou avec des amis ?</w:t>
+        <w:t xml:space="preserve">Voyagez-vous seul, en couple, en famille ou avec des amis ? </w:t>
+      </w:r>
+      <w:ins w:author="Johan DAMIOT" w:id="2" w:date="2024-10-14T08:32:26Z">
+        <w:r>
+          <w:rPr>
+            <w:rFonts w:ascii="Lexend" w:cs="Lexend" w:eastAsia="Lexend" w:hAnsi="Lexend"/>
+            <w:b w:val="1"/>
+            <w:rtl w:val="0"/>
+          </w:rPr>
+          <w:t xml:space="preserve">Pour le quiz voyage plutôt </w:t>
+        </w:r>
+      </w:ins>
+      <w:r>
+        <w:rPr>
+          <w:rtl w:val="0"/>
+        </w:rPr>
       </w:r>
     </w:p>
     <w:p>
@@ -1716,7 +1927,22 @@
           <w:b w:val="1"/>
           <w:rtl w:val="0"/>
         </w:rPr>
-        <w:t xml:space="preserve">Quelle est votre préférence en matière d'hébergement ?</w:t>
+        <w:t xml:space="preserve">Quelle est votre préférence en matière d'hébergement ? </w:t>
+      </w:r>
+      <w:ins w:author="Johan DAMIOT" w:id="3" w:date="2024-10-14T08:32:11Z">
+        <w:r>
+          <w:rPr>
+            <w:rFonts w:ascii="Lexend" w:cs="Lexend" w:eastAsia="Lexend" w:hAnsi="Lexend"/>
+            <w:b w:val="1"/>
+            <w:rtl w:val="0"/>
+          </w:rPr>
+          <w:t xml:space="preserve">Pour le quiz Hôtel plutôt</w:t>
+        </w:r>
+      </w:ins>
+      <w:r>
+        <w:rPr>
+          <w:rtl w:val="0"/>
+        </w:rPr>
       </w:r>
     </w:p>
     <w:p>
@@ -2102,7 +2328,22 @@
           <w:b w:val="1"/>
           <w:rtl w:val="0"/>
         </w:rPr>
-        <w:t xml:space="preserve">Y a-t-il des événements spéciaux ou des festivals que vous aimeriez voir pendant vos vacances ?</w:t>
+        <w:t xml:space="preserve">Y a-t-il des événements spéciaux ou des festivals que vous aimeriez voir pendant vos vacances ? </w:t>
+      </w:r>
+      <w:ins w:author="Johan DAMIOT" w:id="4" w:date="2024-10-14T08:31:48Z">
+        <w:r>
+          <w:rPr>
+            <w:rFonts w:ascii="Lexend" w:cs="Lexend" w:eastAsia="Lexend" w:hAnsi="Lexend"/>
+            <w:b w:val="1"/>
+            <w:rtl w:val="0"/>
+          </w:rPr>
+          <w:t xml:space="preserve">peu être regroupé avec la question plus haut</w:t>
+        </w:r>
+      </w:ins>
+      <w:r>
+        <w:rPr>
+          <w:rtl w:val="0"/>
+        </w:rPr>
       </w:r>
     </w:p>
     <w:p>
@@ -2467,6 +2708,53 @@
         </w:rPr>
         <w:t xml:space="preserve">Quel est le type de paysage qui vous attire le plus ?</w:t>
       </w:r>
+      <w:ins w:author="Johan DAMIOT" w:id="5" w:date="2024-10-14T08:33:27Z">
+        <w:r>
+          <w:rPr>
+            <w:rFonts w:ascii="Lexend" w:cs="Lexend" w:eastAsia="Lexend" w:hAnsi="Lexend"/>
+            <w:b w:val="1"/>
+            <w:rtl w:val="0"/>
+          </w:rPr>
+          <w:t xml:space="preserve"> </w:t>
+        </w:r>
+        <w:r>
+          <w:rPr>
+            <w:rFonts w:ascii="Lexend" w:cs="Lexend" w:eastAsia="Lexend" w:hAnsi="Lexend"/>
+            <w:b w:val="1"/>
+            <w:rtl w:val="0"/>
+          </w:rPr>
+          <w:t xml:space="preserve">peut</w:t>
+        </w:r>
+        <w:r>
+          <w:rPr>
+            <w:rFonts w:ascii="Lexend" w:cs="Lexend" w:eastAsia="Lexend" w:hAnsi="Lexend"/>
+            <w:b w:val="1"/>
+            <w:rtl w:val="0"/>
+          </w:rPr>
+          <w:t xml:space="preserve"> </w:t>
+        </w:r>
+        <w:r>
+          <w:rPr>
+            <w:rFonts w:ascii="Lexend" w:cs="Lexend" w:eastAsia="Lexend" w:hAnsi="Lexend"/>
+            <w:b w:val="1"/>
+            <w:rtl w:val="0"/>
+          </w:rPr>
+          <w:t xml:space="preserve">être</w:t>
+        </w:r>
+        <w:r>
+          <w:rPr>
+            <w:rFonts w:ascii="Lexend" w:cs="Lexend" w:eastAsia="Lexend" w:hAnsi="Lexend"/>
+            <w:b w:val="1"/>
+            <w:rtl w:val="0"/>
+          </w:rPr>
+          <w:t xml:space="preserve"> regroupé avec un question plus haut</w:t>
+        </w:r>
+      </w:ins>
+      <w:r>
+        <w:rPr>
+          <w:rtl w:val="0"/>
+        </w:rPr>
+      </w:r>
     </w:p>
     <w:p>
       <w:pPr>
@@ -2827,6 +3115,21 @@
         </w:rPr>
         <w:t xml:space="preserve">Quelle importance accordez-vous à la gastronomie locale lors de vos voyages ?</w:t>
       </w:r>
+      <w:ins w:author="Johan DAMIOT" w:id="6" w:date="2024-10-14T08:34:58Z">
+        <w:r>
+          <w:rPr>
+            <w:rFonts w:ascii="Lexend" w:cs="Lexend" w:eastAsia="Lexend" w:hAnsi="Lexend"/>
+            <w:b w:val="1"/>
+            <w:rtl w:val="0"/>
+          </w:rPr>
+          <w:t xml:space="preserve">question pour le quiz Activité</w:t>
+        </w:r>
+      </w:ins>
+      <w:r>
+        <w:rPr>
+          <w:rtl w:val="0"/>
+        </w:rPr>
+      </w:r>
     </w:p>
     <w:p>
       <w:pPr>
@@ -2979,6 +3282,21 @@
         </w:rPr>
         <w:t xml:space="preserve">Quel est votre moyen de transport préféré pour voyager ?</w:t>
       </w:r>
+      <w:ins w:author="Johan DAMIOT" w:id="7" w:date="2024-10-14T08:35:19Z">
+        <w:r>
+          <w:rPr>
+            <w:rFonts w:ascii="Lexend" w:cs="Lexend" w:eastAsia="Lexend" w:hAnsi="Lexend"/>
+            <w:b w:val="1"/>
+            <w:rtl w:val="0"/>
+          </w:rPr>
+          <w:t xml:space="preserve"> question pour le quiz voyage</w:t>
+        </w:r>
+      </w:ins>
+      <w:r>
+        <w:rPr>
+          <w:rtl w:val="0"/>
+        </w:rPr>
+      </w:r>
     </w:p>
     <w:p>
       <w:pPr>
@@ -3099,7 +3417,7 @@
       <w:pPr>
         <w:numPr>
           <w:ilvl w:val="0"/>
-          <w:numId w:val="10"/>
+          <w:numId w:val="9"/>
         </w:numPr>
         <w:spacing w:after="0" w:afterAutospacing="0" w:before="240" w:lineRule="auto"/>
         <w:ind w:left="720" w:hanging="360"/>
@@ -3119,7 +3437,7 @@
       <w:pPr>
         <w:numPr>
           <w:ilvl w:val="0"/>
-          <w:numId w:val="10"/>
+          <w:numId w:val="9"/>
         </w:numPr>
         <w:spacing w:after="240" w:before="0" w:beforeAutospacing="0" w:lineRule="auto"/>
         <w:ind w:left="720" w:hanging="360"/>
@@ -3171,6 +3489,37 @@
         </w:rPr>
         <w:t xml:space="preserve">Avez-vous des préférences concernant les fuseaux horaires ?</w:t>
       </w:r>
+      <w:ins w:author="Johan DAMIOT" w:id="8" w:date="2024-10-14T08:35:34Z">
+        <w:r>
+          <w:rPr>
+            <w:rFonts w:ascii="Lexend" w:cs="Lexend" w:eastAsia="Lexend" w:hAnsi="Lexend"/>
+            <w:b w:val="1"/>
+            <w:rtl w:val="0"/>
+          </w:rPr>
+          <w:t xml:space="preserve"> vraiment </w:t>
+        </w:r>
+        <w:r>
+          <w:rPr>
+            <w:rFonts w:ascii="Lexend" w:cs="Lexend" w:eastAsia="Lexend" w:hAnsi="Lexend"/>
+            <w:b w:val="1"/>
+            <w:rtl w:val="0"/>
+          </w:rPr>
+          <w:t xml:space="preserve">nécessaire</w:t>
+        </w:r>
+        <w:r>
+          <w:rPr>
+            <w:rFonts w:ascii="Lexend" w:cs="Lexend" w:eastAsia="Lexend" w:hAnsi="Lexend"/>
+            <w:b w:val="1"/>
+            <w:rtl w:val="0"/>
+          </w:rPr>
+          <w:t xml:space="preserve"> ?</w:t>
+        </w:r>
+      </w:ins>
+      <w:r>
+        <w:rPr>
+          <w:rtl w:val="0"/>
+        </w:rPr>
+      </w:r>
     </w:p>
     <w:p>
       <w:pPr>
@@ -3234,6 +3583,37 @@
         </w:rPr>
         <w:t xml:space="preserve">Êtes-vous intéressé par des destinations qui offrent des expériences uniques ou atypiques ?</w:t>
       </w:r>
+      <w:ins w:author="Johan DAMIOT" w:id="9" w:date="2024-10-14T08:36:16Z">
+        <w:r>
+          <w:rPr>
+            <w:rFonts w:ascii="Lexend" w:cs="Lexend" w:eastAsia="Lexend" w:hAnsi="Lexend"/>
+            <w:b w:val="1"/>
+            <w:rtl w:val="0"/>
+          </w:rPr>
+          <w:t xml:space="preserve"> peut </w:t>
+        </w:r>
+        <w:r>
+          <w:rPr>
+            <w:rFonts w:ascii="Lexend" w:cs="Lexend" w:eastAsia="Lexend" w:hAnsi="Lexend"/>
+            <w:b w:val="1"/>
+            <w:rtl w:val="0"/>
+          </w:rPr>
+          <w:t xml:space="preserve">être</w:t>
+        </w:r>
+        <w:r>
+          <w:rPr>
+            <w:rFonts w:ascii="Lexend" w:cs="Lexend" w:eastAsia="Lexend" w:hAnsi="Lexend"/>
+            <w:b w:val="1"/>
+            <w:rtl w:val="0"/>
+          </w:rPr>
+          <w:t xml:space="preserve"> regroupé avec un question plus haut</w:t>
+        </w:r>
+      </w:ins>
+      <w:r>
+        <w:rPr>
+          <w:rtl w:val="0"/>
+        </w:rPr>
+      </w:r>
     </w:p>
     <w:p>
       <w:pPr>
@@ -3311,6 +3691,21 @@
         </w:rPr>
         <w:t xml:space="preserve"> Quel est votre niveau de confort avec les aventures en plein air ?</w:t>
       </w:r>
+      <w:ins w:author="Johan DAMIOT" w:id="10" w:date="2024-10-14T08:36:34Z">
+        <w:r>
+          <w:rPr>
+            <w:rFonts w:ascii="Lexend" w:cs="Lexend" w:eastAsia="Lexend" w:hAnsi="Lexend"/>
+            <w:b w:val="1"/>
+            <w:rtl w:val="0"/>
+          </w:rPr>
+          <w:t xml:space="preserve"> trop spécifique</w:t>
+        </w:r>
+      </w:ins>
+      <w:r>
+        <w:rPr>
+          <w:rtl w:val="0"/>
+        </w:rPr>
+      </w:r>
     </w:p>
     <w:p>
       <w:pPr>
@@ -3463,6 +3858,53 @@
         </w:rPr>
         <w:t xml:space="preserve"> Avez-vous des préférences pour des activités de bien-être pendant vos vacances ?</w:t>
       </w:r>
+      <w:ins w:author="Johan DAMIOT" w:id="11" w:date="2024-10-14T08:36:54Z">
+        <w:r>
+          <w:rPr>
+            <w:rFonts w:ascii="Lexend" w:cs="Lexend" w:eastAsia="Lexend" w:hAnsi="Lexend"/>
+            <w:b w:val="1"/>
+            <w:rtl w:val="0"/>
+          </w:rPr>
+          <w:t xml:space="preserve"> </w:t>
+        </w:r>
+        <w:r>
+          <w:rPr>
+            <w:rFonts w:ascii="Lexend" w:cs="Lexend" w:eastAsia="Lexend" w:hAnsi="Lexend"/>
+            <w:b w:val="1"/>
+            <w:rtl w:val="0"/>
+          </w:rPr>
+          <w:t xml:space="preserve">peut</w:t>
+        </w:r>
+        <w:r>
+          <w:rPr>
+            <w:rFonts w:ascii="Lexend" w:cs="Lexend" w:eastAsia="Lexend" w:hAnsi="Lexend"/>
+            <w:b w:val="1"/>
+            <w:rtl w:val="0"/>
+          </w:rPr>
+          <w:t xml:space="preserve"> </w:t>
+        </w:r>
+        <w:r>
+          <w:rPr>
+            <w:rFonts w:ascii="Lexend" w:cs="Lexend" w:eastAsia="Lexend" w:hAnsi="Lexend"/>
+            <w:b w:val="1"/>
+            <w:rtl w:val="0"/>
+          </w:rPr>
+          <w:t xml:space="preserve">être</w:t>
+        </w:r>
+        <w:r>
+          <w:rPr>
+            <w:rFonts w:ascii="Lexend" w:cs="Lexend" w:eastAsia="Lexend" w:hAnsi="Lexend"/>
+            <w:b w:val="1"/>
+            <w:rtl w:val="0"/>
+          </w:rPr>
+          <w:t xml:space="preserve"> regroupé avec un question plus haut</w:t>
+        </w:r>
+      </w:ins>
+      <w:r>
+        <w:rPr>
+          <w:rtl w:val="0"/>
+        </w:rPr>
+      </w:r>
     </w:p>
     <w:p>
       <w:pPr>
@@ -3523,7 +3965,7 @@
       <w:pPr>
         <w:numPr>
           <w:ilvl w:val="0"/>
-          <w:numId w:val="43"/>
+          <w:numId w:val="45"/>
         </w:numPr>
         <w:spacing w:after="0" w:afterAutospacing="0" w:before="240" w:lineRule="auto"/>
         <w:ind w:left="720" w:hanging="360"/>
@@ -3543,7 +3985,7 @@
       <w:pPr>
         <w:numPr>
           <w:ilvl w:val="0"/>
-          <w:numId w:val="43"/>
+          <w:numId w:val="45"/>
         </w:numPr>
         <w:spacing w:after="240" w:before="0" w:beforeAutospacing="0" w:lineRule="auto"/>
         <w:ind w:left="720" w:hanging="360"/>
@@ -3593,7 +4035,22 @@
           <w:b w:val="1"/>
           <w:rtl w:val="0"/>
         </w:rPr>
-        <w:t xml:space="preserve">Quelle est l'importance de la durabilité et de l'écoresponsabilité pour vous lors de vos voyages ?</w:t>
+        <w:t xml:space="preserve">Quelle est l'importance de la durabilité et de l'éco responsabilité pour vous lors de vos voyages ?</w:t>
+      </w:r>
+      <w:ins w:author="Johan DAMIOT" w:id="12" w:date="2024-10-14T08:37:23Z">
+        <w:r>
+          <w:rPr>
+            <w:rFonts w:ascii="Lexend" w:cs="Lexend" w:eastAsia="Lexend" w:hAnsi="Lexend"/>
+            <w:b w:val="1"/>
+            <w:rtl w:val="0"/>
+          </w:rPr>
+          <w:t xml:space="preserve"> question pour le quiz voyage</w:t>
+        </w:r>
+      </w:ins>
+      <w:r>
+        <w:rPr>
+          <w:rtl w:val="0"/>
+        </w:rPr>
       </w:r>
     </w:p>
     <w:p>
@@ -3733,12 +4190,43 @@
         </w:rPr>
         <w:t xml:space="preserve">Êtes-vous intéressé par des destinations avec des événements spécifiques pendant vos dates de voyage ?</w:t>
       </w:r>
-    </w:p>
-    <w:p>
-      <w:pPr>
-        <w:numPr>
-          <w:ilvl w:val="0"/>
-          <w:numId w:val="45"/>
+      <w:ins w:author="Johan DAMIOT" w:id="13" w:date="2024-10-14T08:37:48Z">
+        <w:r>
+          <w:rPr>
+            <w:rFonts w:ascii="Lexend" w:cs="Lexend" w:eastAsia="Lexend" w:hAnsi="Lexend"/>
+            <w:b w:val="1"/>
+            <w:rtl w:val="0"/>
+          </w:rPr>
+          <w:t xml:space="preserve"> peut </w:t>
+        </w:r>
+        <w:r>
+          <w:rPr>
+            <w:rFonts w:ascii="Lexend" w:cs="Lexend" w:eastAsia="Lexend" w:hAnsi="Lexend"/>
+            <w:b w:val="1"/>
+            <w:rtl w:val="0"/>
+          </w:rPr>
+          <w:t xml:space="preserve">être</w:t>
+        </w:r>
+        <w:r>
+          <w:rPr>
+            <w:rFonts w:ascii="Lexend" w:cs="Lexend" w:eastAsia="Lexend" w:hAnsi="Lexend"/>
+            <w:b w:val="1"/>
+            <w:rtl w:val="0"/>
+          </w:rPr>
+          <w:t xml:space="preserve"> regroupé avec une question plus haut</w:t>
+        </w:r>
+      </w:ins>
+      <w:r>
+        <w:rPr>
+          <w:rtl w:val="0"/>
+        </w:rPr>
+      </w:r>
+    </w:p>
+    <w:p>
+      <w:pPr>
+        <w:numPr>
+          <w:ilvl w:val="0"/>
+          <w:numId w:val="47"/>
         </w:numPr>
         <w:spacing w:after="0" w:afterAutospacing="0" w:before="0" w:beforeAutospacing="0" w:lineRule="auto"/>
         <w:ind w:left="720" w:hanging="360"/>
@@ -3758,7 +4246,7 @@
       <w:pPr>
         <w:numPr>
           <w:ilvl w:val="0"/>
-          <w:numId w:val="45"/>
+          <w:numId w:val="47"/>
         </w:numPr>
         <w:spacing w:after="240" w:before="0" w:beforeAutospacing="0" w:lineRule="auto"/>
         <w:ind w:left="720" w:hanging="360"/>
@@ -3865,6 +4353,21 @@
         </w:rPr>
         <w:t xml:space="preserve"> Avez-vous des destinations que vous avez déjà visitées et que vous aimeriez revisiter ?</w:t>
       </w:r>
+      <w:ins w:author="Johan DAMIOT" w:id="14" w:date="2024-10-14T08:38:14Z">
+        <w:r>
+          <w:rPr>
+            <w:rFonts w:ascii="Lexend" w:cs="Lexend" w:eastAsia="Lexend" w:hAnsi="Lexend"/>
+            <w:b w:val="1"/>
+            <w:rtl w:val="0"/>
+          </w:rPr>
+          <w:t xml:space="preserve">trop spécifique</w:t>
+        </w:r>
+      </w:ins>
+      <w:r>
+        <w:rPr>
+          <w:rtl w:val="0"/>
+        </w:rPr>
+      </w:r>
     </w:p>
     <w:p>
       <w:pPr>
@@ -3996,6 +4499,37 @@
           <w:rtl w:val="0"/>
         </w:rPr>
         <w:t xml:space="preserve"> Quel est votre rythme de voyage préféré ?</w:t>
+      </w:r>
+      <w:ins w:author="Johan DAMIOT" w:id="15" w:date="2024-10-14T08:38:26Z">
+        <w:r>
+          <w:rPr>
+            <w:rFonts w:ascii="Lexend" w:cs="Lexend" w:eastAsia="Lexend" w:hAnsi="Lexend"/>
+            <w:b w:val="1"/>
+            <w:rtl w:val="0"/>
+          </w:rPr>
+          <w:t xml:space="preserve"> a t’on vraiment </w:t>
+        </w:r>
+        <w:r>
+          <w:rPr>
+            <w:rFonts w:ascii="Lexend" w:cs="Lexend" w:eastAsia="Lexend" w:hAnsi="Lexend"/>
+            <w:b w:val="1"/>
+            <w:rtl w:val="0"/>
+          </w:rPr>
+          <w:t xml:space="preserve">besoin</w:t>
+        </w:r>
+        <w:r>
+          <w:rPr>
+            <w:rFonts w:ascii="Lexend" w:cs="Lexend" w:eastAsia="Lexend" w:hAnsi="Lexend"/>
+            <w:b w:val="1"/>
+            <w:rtl w:val="0"/>
+          </w:rPr>
+          <w:t xml:space="preserve"> de cette information</w:t>
+        </w:r>
+      </w:ins>
+      <w:r>
+        <w:rPr>
+          <w:rtl w:val="0"/>
+        </w:rPr>
       </w:r>
     </w:p>
     <w:p>
@@ -5146,7 +5680,7 @@
       <w:lvlText w:val="●"/>
       <w:lvlJc w:val="left"/>
       <w:pPr>
-        <w:ind w:left="720" w:hanging="360"/>
+        <w:ind w:left="1440" w:hanging="360"/>
       </w:pPr>
       <w:rPr>
         <w:u w:val="none"/>
@@ -5158,7 +5692,7 @@
       <w:lvlText w:val="○"/>
       <w:lvlJc w:val="left"/>
       <w:pPr>
-        <w:ind w:left="1440" w:hanging="360"/>
+        <w:ind w:left="2160" w:hanging="360"/>
       </w:pPr>
       <w:rPr>
         <w:u w:val="none"/>
@@ -5170,7 +5704,7 @@
       <w:lvlText w:val="■"/>
       <w:lvlJc w:val="left"/>
       <w:pPr>
-        <w:ind w:left="2160" w:hanging="360"/>
+        <w:ind w:left="2880" w:hanging="360"/>
       </w:pPr>
       <w:rPr>
         <w:u w:val="none"/>
@@ -5182,7 +5716,7 @@
       <w:lvlText w:val="●"/>
       <w:lvlJc w:val="left"/>
       <w:pPr>
-        <w:ind w:left="2880" w:hanging="360"/>
+        <w:ind w:left="3600" w:hanging="360"/>
       </w:pPr>
       <w:rPr>
         <w:u w:val="none"/>
@@ -5194,7 +5728,7 @@
       <w:lvlText w:val="○"/>
       <w:lvlJc w:val="left"/>
       <w:pPr>
-        <w:ind w:left="3600" w:hanging="360"/>
+        <w:ind w:left="4320" w:hanging="360"/>
       </w:pPr>
       <w:rPr>
         <w:u w:val="none"/>
@@ -5206,7 +5740,7 @@
       <w:lvlText w:val="■"/>
       <w:lvlJc w:val="left"/>
       <w:pPr>
-        <w:ind w:left="4320" w:hanging="360"/>
+        <w:ind w:left="5040" w:hanging="360"/>
       </w:pPr>
       <w:rPr>
         <w:u w:val="none"/>
@@ -5218,7 +5752,7 @@
       <w:lvlText w:val="●"/>
       <w:lvlJc w:val="left"/>
       <w:pPr>
-        <w:ind w:left="5040" w:hanging="360"/>
+        <w:ind w:left="5760" w:hanging="360"/>
       </w:pPr>
       <w:rPr>
         <w:u w:val="none"/>
@@ -5230,7 +5764,7 @@
       <w:lvlText w:val="○"/>
       <w:lvlJc w:val="left"/>
       <w:pPr>
-        <w:ind w:left="5760" w:hanging="360"/>
+        <w:ind w:left="6480" w:hanging="360"/>
       </w:pPr>
       <w:rPr>
         <w:u w:val="none"/>
@@ -5242,7 +5776,7 @@
       <w:lvlText w:val="■"/>
       <w:lvlJc w:val="left"/>
       <w:pPr>
-        <w:ind w:left="6480" w:hanging="360"/>
+        <w:ind w:left="7200" w:hanging="360"/>
       </w:pPr>
       <w:rPr>
         <w:u w:val="none"/>
@@ -8990,6 +9524,226 @@
     </w:lvl>
   </w:abstractNum>
   <w:abstractNum w:abstractNumId="45">
+    <w:lvl w:ilvl="0">
+      <w:start w:val="1"/>
+      <w:numFmt w:val="bullet"/>
+      <w:lvlText w:val="●"/>
+      <w:lvlJc w:val="left"/>
+      <w:pPr>
+        <w:ind w:left="720" w:hanging="360"/>
+      </w:pPr>
+      <w:rPr>
+        <w:u w:val="none"/>
+      </w:rPr>
+    </w:lvl>
+    <w:lvl w:ilvl="1">
+      <w:start w:val="1"/>
+      <w:numFmt w:val="bullet"/>
+      <w:lvlText w:val="○"/>
+      <w:lvlJc w:val="left"/>
+      <w:pPr>
+        <w:ind w:left="1440" w:hanging="360"/>
+      </w:pPr>
+      <w:rPr>
+        <w:u w:val="none"/>
+      </w:rPr>
+    </w:lvl>
+    <w:lvl w:ilvl="2">
+      <w:start w:val="1"/>
+      <w:numFmt w:val="bullet"/>
+      <w:lvlText w:val="■"/>
+      <w:lvlJc w:val="left"/>
+      <w:pPr>
+        <w:ind w:left="2160" w:hanging="360"/>
+      </w:pPr>
+      <w:rPr>
+        <w:u w:val="none"/>
+      </w:rPr>
+    </w:lvl>
+    <w:lvl w:ilvl="3">
+      <w:start w:val="1"/>
+      <w:numFmt w:val="bullet"/>
+      <w:lvlText w:val="●"/>
+      <w:lvlJc w:val="left"/>
+      <w:pPr>
+        <w:ind w:left="2880" w:hanging="360"/>
+      </w:pPr>
+      <w:rPr>
+        <w:u w:val="none"/>
+      </w:rPr>
+    </w:lvl>
+    <w:lvl w:ilvl="4">
+      <w:start w:val="1"/>
+      <w:numFmt w:val="bullet"/>
+      <w:lvlText w:val="○"/>
+      <w:lvlJc w:val="left"/>
+      <w:pPr>
+        <w:ind w:left="3600" w:hanging="360"/>
+      </w:pPr>
+      <w:rPr>
+        <w:u w:val="none"/>
+      </w:rPr>
+    </w:lvl>
+    <w:lvl w:ilvl="5">
+      <w:start w:val="1"/>
+      <w:numFmt w:val="bullet"/>
+      <w:lvlText w:val="■"/>
+      <w:lvlJc w:val="left"/>
+      <w:pPr>
+        <w:ind w:left="4320" w:hanging="360"/>
+      </w:pPr>
+      <w:rPr>
+        <w:u w:val="none"/>
+      </w:rPr>
+    </w:lvl>
+    <w:lvl w:ilvl="6">
+      <w:start w:val="1"/>
+      <w:numFmt w:val="bullet"/>
+      <w:lvlText w:val="●"/>
+      <w:lvlJc w:val="left"/>
+      <w:pPr>
+        <w:ind w:left="5040" w:hanging="360"/>
+      </w:pPr>
+      <w:rPr>
+        <w:u w:val="none"/>
+      </w:rPr>
+    </w:lvl>
+    <w:lvl w:ilvl="7">
+      <w:start w:val="1"/>
+      <w:numFmt w:val="bullet"/>
+      <w:lvlText w:val="○"/>
+      <w:lvlJc w:val="left"/>
+      <w:pPr>
+        <w:ind w:left="5760" w:hanging="360"/>
+      </w:pPr>
+      <w:rPr>
+        <w:u w:val="none"/>
+      </w:rPr>
+    </w:lvl>
+    <w:lvl w:ilvl="8">
+      <w:start w:val="1"/>
+      <w:numFmt w:val="bullet"/>
+      <w:lvlText w:val="■"/>
+      <w:lvlJc w:val="left"/>
+      <w:pPr>
+        <w:ind w:left="6480" w:hanging="360"/>
+      </w:pPr>
+      <w:rPr>
+        <w:u w:val="none"/>
+      </w:rPr>
+    </w:lvl>
+  </w:abstractNum>
+  <w:abstractNum w:abstractNumId="46">
+    <w:lvl w:ilvl="0">
+      <w:start w:val="1"/>
+      <w:numFmt w:val="bullet"/>
+      <w:lvlText w:val="●"/>
+      <w:lvlJc w:val="left"/>
+      <w:pPr>
+        <w:ind w:left="720" w:hanging="360"/>
+      </w:pPr>
+      <w:rPr>
+        <w:u w:val="none"/>
+      </w:rPr>
+    </w:lvl>
+    <w:lvl w:ilvl="1">
+      <w:start w:val="1"/>
+      <w:numFmt w:val="bullet"/>
+      <w:lvlText w:val="○"/>
+      <w:lvlJc w:val="left"/>
+      <w:pPr>
+        <w:ind w:left="1440" w:hanging="360"/>
+      </w:pPr>
+      <w:rPr>
+        <w:u w:val="none"/>
+      </w:rPr>
+    </w:lvl>
+    <w:lvl w:ilvl="2">
+      <w:start w:val="1"/>
+      <w:numFmt w:val="bullet"/>
+      <w:lvlText w:val="■"/>
+      <w:lvlJc w:val="left"/>
+      <w:pPr>
+        <w:ind w:left="2160" w:hanging="360"/>
+      </w:pPr>
+      <w:rPr>
+        <w:u w:val="none"/>
+      </w:rPr>
+    </w:lvl>
+    <w:lvl w:ilvl="3">
+      <w:start w:val="1"/>
+      <w:numFmt w:val="bullet"/>
+      <w:lvlText w:val="●"/>
+      <w:lvlJc w:val="left"/>
+      <w:pPr>
+        <w:ind w:left="2880" w:hanging="360"/>
+      </w:pPr>
+      <w:rPr>
+        <w:u w:val="none"/>
+      </w:rPr>
+    </w:lvl>
+    <w:lvl w:ilvl="4">
+      <w:start w:val="1"/>
+      <w:numFmt w:val="bullet"/>
+      <w:lvlText w:val="○"/>
+      <w:lvlJc w:val="left"/>
+      <w:pPr>
+        <w:ind w:left="3600" w:hanging="360"/>
+      </w:pPr>
+      <w:rPr>
+        <w:u w:val="none"/>
+      </w:rPr>
+    </w:lvl>
+    <w:lvl w:ilvl="5">
+      <w:start w:val="1"/>
+      <w:numFmt w:val="bullet"/>
+      <w:lvlText w:val="■"/>
+      <w:lvlJc w:val="left"/>
+      <w:pPr>
+        <w:ind w:left="4320" w:hanging="360"/>
+      </w:pPr>
+      <w:rPr>
+        <w:u w:val="none"/>
+      </w:rPr>
+    </w:lvl>
+    <w:lvl w:ilvl="6">
+      <w:start w:val="1"/>
+      <w:numFmt w:val="bullet"/>
+      <w:lvlText w:val="●"/>
+      <w:lvlJc w:val="left"/>
+      <w:pPr>
+        <w:ind w:left="5040" w:hanging="360"/>
+      </w:pPr>
+      <w:rPr>
+        <w:u w:val="none"/>
+      </w:rPr>
+    </w:lvl>
+    <w:lvl w:ilvl="7">
+      <w:start w:val="1"/>
+      <w:numFmt w:val="bullet"/>
+      <w:lvlText w:val="○"/>
+      <w:lvlJc w:val="left"/>
+      <w:pPr>
+        <w:ind w:left="5760" w:hanging="360"/>
+      </w:pPr>
+      <w:rPr>
+        <w:u w:val="none"/>
+      </w:rPr>
+    </w:lvl>
+    <w:lvl w:ilvl="8">
+      <w:start w:val="1"/>
+      <w:numFmt w:val="bullet"/>
+      <w:lvlText w:val="■"/>
+      <w:lvlJc w:val="left"/>
+      <w:pPr>
+        <w:ind w:left="6480" w:hanging="360"/>
+      </w:pPr>
+      <w:rPr>
+        <w:u w:val="none"/>
+      </w:rPr>
+    </w:lvl>
+  </w:abstractNum>
+  <w:abstractNum w:abstractNumId="47">
     <w:lvl w:ilvl="0">
       <w:start w:val="1"/>
       <w:numFmt w:val="bullet"/>
@@ -9233,6 +9987,12 @@
   </w:num>
   <w:num w:numId="45">
     <w:abstractNumId w:val="45"/>
+  </w:num>
+  <w:num w:numId="46">
+    <w:abstractNumId w:val="46"/>
+  </w:num>
+  <w:num w:numId="47">
+    <w:abstractNumId w:val="47"/>
   </w:num>
 </w:numbering>
 </file>

</xml_diff>